<commit_message>
just a bunch of changes
</commit_message>
<xml_diff>
--- a/raw files/H1 GP/exam papers/prelim IN/2025 TJC P2 prelim H1 GP.docx
+++ b/raw files/H1 GP/exam papers/prelim IN/2025 TJC P2 prelim H1 GP.docx
@@ -1,6 +1,6 @@
 
 <file path=word/document.xml><?xml version="1.0" encoding="utf-8"?>
-<w:document xmlns:wpc="http://schemas.microsoft.com/office/word/2010/wordprocessingCanvas" xmlns:cx="http://schemas.microsoft.com/office/drawing/2014/chartex" xmlns:cx1="http://schemas.microsoft.com/office/drawing/2015/9/8/chartex" xmlns:cx2="http://schemas.microsoft.com/office/drawing/2015/10/21/chartex" xmlns:cx3="http://schemas.microsoft.com/office/drawing/2016/5/9/chartex" xmlns:cx4="http://schemas.microsoft.com/office/drawing/2016/5/10/chartex" xmlns:cx5="http://schemas.microsoft.com/office/drawing/2016/5/11/chartex" xmlns:cx6="http://schemas.microsoft.com/office/drawing/2016/5/12/chartex" xmlns:cx7="http://schemas.microsoft.com/office/drawing/2016/5/13/chartex" xmlns:cx8="http://schemas.microsoft.com/office/drawing/2016/5/14/chartex" xmlns:mc="http://schemas.openxmlformats.org/markup-compatibility/2006" xmlns:m="http://schemas.openxmlformats.org/officeDocument/2006/math" xmlns:aink="http://schemas.microsoft.com/office/drawing/2016/ink" xmlns:am3d="http://schemas.microsoft.com/office/drawing/2017/model3d" xmlns:oel="http://schemas.microsoft.com/office/2019/extlst" xmlns:r="http://schemas.openxmlformats.org/officeDocument/2006/relationships" xmlns:wp14="http://schemas.microsoft.com/office/word/2010/wordprocessingDrawing" xmlns:wp="http://schemas.openxmlformats.org/drawingml/2006/wordprocessingDrawing" xmlns:wpg="http://schemas.microsoft.com/office/word/2010/wordprocessingGroup" xmlns:wpi="http://schemas.microsoft.com/office/word/2010/wordprocessingInk" xmlns:wps="http://schemas.microsoft.com/office/word/2010/wordprocessingShape" xmlns:o="urn:schemas-microsoft-com:office:office" xmlns:v="urn:schemas-microsoft-com:vml" xmlns:w10="urn:schemas-microsoft-com:office:word" xmlns:w="http://schemas.openxmlformats.org/wordprocessingml/2006/main" xmlns:w14="http://schemas.microsoft.com/office/word/2010/wordml" xmlns:w15="http://schemas.microsoft.com/office/word/2012/wordml" xmlns:w16cex="http://schemas.microsoft.com/office/word/2018/wordml/cex" xmlns:w16cid="http://schemas.microsoft.com/office/word/2016/wordml/cid" xmlns:w16="http://schemas.microsoft.com/office/word/2018/wordml" xmlns:w16sdtdh="http://schemas.microsoft.com/office/word/2020/wordml/sdtdatahash" xmlns:w16sdtfl="http://schemas.microsoft.com/office/word/2024/wordml/sdtformatlock" xmlns:w16se="http://schemas.microsoft.com/office/word/2015/wordml/symex" xmlns:w16du="http://schemas.microsoft.com/office/word/2023/wordml/word16du" xmlns:wne="http://schemas.microsoft.com/office/word/2006/wordml" mc:Ignorable="w14 w15 w16se w16cid w16 w16cex w16sdtdh w16sdtfl w16du wp14">
+<w:document xmlns:wpc="http://schemas.microsoft.com/office/word/2010/wordprocessingCanvas" xmlns:cx="http://schemas.microsoft.com/office/drawing/2014/chartex" xmlns:cx1="http://schemas.microsoft.com/office/drawing/2015/9/8/chartex" xmlns:cx2="http://schemas.microsoft.com/office/drawing/2015/10/21/chartex" xmlns:cx3="http://schemas.microsoft.com/office/drawing/2016/5/9/chartex" xmlns:cx4="http://schemas.microsoft.com/office/drawing/2016/5/10/chartex" xmlns:cx5="http://schemas.microsoft.com/office/drawing/2016/5/11/chartex" xmlns:cx6="http://schemas.microsoft.com/office/drawing/2016/5/12/chartex" xmlns:cx7="http://schemas.microsoft.com/office/drawing/2016/5/13/chartex" xmlns:cx8="http://schemas.microsoft.com/office/drawing/2016/5/14/chartex" xmlns:mc="http://schemas.openxmlformats.org/markup-compatibility/2006" xmlns:aink="http://schemas.microsoft.com/office/drawing/2016/ink" xmlns:am3d="http://schemas.microsoft.com/office/drawing/2017/model3d" xmlns:o="urn:schemas-microsoft-com:office:office" xmlns:oel="http://schemas.microsoft.com/office/2019/extlst" xmlns:r="http://schemas.openxmlformats.org/officeDocument/2006/relationships" xmlns:m="http://schemas.openxmlformats.org/officeDocument/2006/math" xmlns:v="urn:schemas-microsoft-com:vml" xmlns:wp14="http://schemas.microsoft.com/office/word/2010/wordprocessingDrawing" xmlns:wp="http://schemas.openxmlformats.org/drawingml/2006/wordprocessingDrawing" xmlns:w10="urn:schemas-microsoft-com:office:word" xmlns:w="http://schemas.openxmlformats.org/wordprocessingml/2006/main" xmlns:w14="http://schemas.microsoft.com/office/word/2010/wordml" xmlns:w15="http://schemas.microsoft.com/office/word/2012/wordml" xmlns:w16cex="http://schemas.microsoft.com/office/word/2018/wordml/cex" xmlns:w16cid="http://schemas.microsoft.com/office/word/2016/wordml/cid" xmlns:w16="http://schemas.microsoft.com/office/word/2018/wordml" xmlns:w16du="http://schemas.microsoft.com/office/word/2023/wordml/word16du" xmlns:w16sdtdh="http://schemas.microsoft.com/office/word/2020/wordml/sdtdatahash" xmlns:w16sdtfl="http://schemas.microsoft.com/office/word/2024/wordml/sdtformatlock" xmlns:w16se="http://schemas.microsoft.com/office/word/2015/wordml/symex" xmlns:wpg="http://schemas.microsoft.com/office/word/2010/wordprocessingGroup" xmlns:wpi="http://schemas.microsoft.com/office/word/2010/wordprocessingInk" xmlns:wne="http://schemas.microsoft.com/office/word/2006/wordml" xmlns:wps="http://schemas.microsoft.com/office/word/2010/wordprocessingShape" mc:Ignorable="w14 w15 w16se w16cid w16 w16cex w16sdtdh w16sdtfl w16du wp14">
   <w:body>
     <w:p>
       <w:pPr>
@@ -101,21 +101,20 @@
               <w:rPr>
                 <w:szCs w:val="24"/>
               </w:rPr>
-              <w:t xml:space="preserve">In an age where we can shop in our pyjamas and order anything from exotic fruits to a new sofa without leaving our couches, there is something deeply disorienting about the lack of interaction and loss of human touch in the transaction. Now, the closest thing to a face-to-face encounter is an automated recommendation telling you, “Others who bought this also liked…”. We lose the ability to judge the quality of an item beyond a well-edited image or a handful of reviews. Many shoppers are increasingly disillusioned. Online shopping promises </w:t>
-            </w:r>
-            <w:proofErr w:type="gramStart"/>
-            <w:r>
-              <w:rPr>
-                <w:szCs w:val="24"/>
-              </w:rPr>
-              <w:t>variety, but</w:t>
-            </w:r>
-            <w:proofErr w:type="gramEnd"/>
-            <w:r>
-              <w:rPr>
-                <w:szCs w:val="24"/>
-              </w:rPr>
-              <w:t xml:space="preserve"> often delivers frustration in the form of misleading images, vague descriptions and unpredictable sizing. </w:t>
+              <w:t xml:space="preserve">In an age where we can shop in our pyjamas and order anything from exotic fruits to a new sofa without leaving our couches, there is something deeply disorienting about the lack of interaction and loss of human touch in the transaction. Now, the closest thing to a face-to-face encounter is an automated recommendation telling you, “Others who bought this also liked…”. We lose the ability to judge the quality of an item beyond a well-edited image or a handful of reviews. Many shoppers are </w:t>
+            </w:r>
+            <w:r>
+              <w:rPr>
+                <w:szCs w:val="24"/>
+                <w:highlight w:val="yellow"/>
+              </w:rPr>
+              <w:t>increasingly disillusioned</w:t>
+            </w:r>
+            <w:r>
+              <w:rPr>
+                <w:szCs w:val="24"/>
+              </w:rPr>
+              <w:t xml:space="preserve">. Online shopping promises variety, but often delivers frustration in the form of misleading images, vague descriptions and unpredictable sizing. </w:t>
             </w:r>
           </w:p>
           <w:p>
@@ -309,21 +308,7 @@
               <w:rPr>
                 <w:szCs w:val="24"/>
               </w:rPr>
-              <w:t xml:space="preserve"> after their latest purchase arrives. Many shoppers find themselves trapped in a loop of impulse buying, only to discover a growing problem of personal debt and that the satisfaction of owning more stuff is fleeting at best. And the process of returning the item is a cumbersome </w:t>
-            </w:r>
-            <w:proofErr w:type="gramStart"/>
-            <w:r>
-              <w:rPr>
-                <w:szCs w:val="24"/>
-              </w:rPr>
-              <w:t>chore in itself, which</w:t>
-            </w:r>
-            <w:proofErr w:type="gramEnd"/>
-            <w:r>
-              <w:rPr>
-                <w:szCs w:val="24"/>
-              </w:rPr>
-              <w:t xml:space="preserve"> seems ironic given the promise of convenience.</w:t>
+              <w:t xml:space="preserve"> after their latest purchase arrives. Many shoppers find themselves trapped in a loop of impulse buying, only to discover a growing problem of personal debt and that the satisfaction of owning more stuff is fleeting at best. And the process of returning the item is a cumbersome chore in itself, which seems ironic given the promise of convenience.</w:t>
             </w:r>
           </w:p>
           <w:p>
@@ -703,7 +688,20 @@
               <w:rPr>
                 <w:szCs w:val="24"/>
               </w:rPr>
-              <w:t>rick-and-mortar shops are becoming the endangered species of the retail world. Empty storefronts are now a common sight in city centres, as independent shops struggle to compete with global giants like Amazon. Small stores</w:t>
+              <w:t xml:space="preserve">rick-and-mortar shops are becoming the </w:t>
+            </w:r>
+            <w:r>
+              <w:rPr>
+                <w:szCs w:val="24"/>
+                <w:highlight w:val="yellow"/>
+              </w:rPr>
+              <w:t>endangered species</w:t>
+            </w:r>
+            <w:r>
+              <w:rPr>
+                <w:szCs w:val="24"/>
+              </w:rPr>
+              <w:t xml:space="preserve"> of the retail world. Empty storefronts are now a common sight in city centres, as independent shops struggle to compete with global giants like Amazon. Small stores</w:t>
             </w:r>
             <w:r>
               <w:rPr>
@@ -799,13 +797,14 @@
               <w:rPr>
                 <w:szCs w:val="24"/>
               </w:rPr>
-              <w:t>nline shopping quietly siphon</w:t>
-            </w:r>
-            <w:r>
-              <w:rPr>
-                <w:szCs w:val="24"/>
-              </w:rPr>
-              <w:t>s</w:t>
+              <w:t xml:space="preserve">nline shopping </w:t>
+            </w:r>
+            <w:r>
+              <w:rPr>
+                <w:szCs w:val="24"/>
+                <w:highlight w:val="yellow"/>
+              </w:rPr>
+              <w:t>quietly siphons</w:t>
             </w:r>
             <w:r>
               <w:rPr>
@@ -1380,21 +1379,7 @@
               <w:rPr>
                 <w:szCs w:val="24"/>
               </w:rPr>
-              <w:t xml:space="preserve">re tempted by the siren call of online shopping, take a moment to consider: is it </w:t>
-            </w:r>
-            <w:proofErr w:type="gramStart"/>
-            <w:r>
-              <w:rPr>
-                <w:szCs w:val="24"/>
-              </w:rPr>
-              <w:t>really worth</w:t>
-            </w:r>
-            <w:proofErr w:type="gramEnd"/>
-            <w:r>
-              <w:rPr>
-                <w:szCs w:val="24"/>
-              </w:rPr>
-              <w:t xml:space="preserve"> the cost?</w:t>
+              <w:t>re tempted by the siren call of online shopping, take a moment to consider: is it really worth the cost?</w:t>
             </w:r>
           </w:p>
         </w:tc>
@@ -1522,13 +1507,41 @@
               <w:jc w:val="both"/>
             </w:pPr>
             <w:r>
-              <w:t>Online stores have an almost limitless inventory</w:t>
-            </w:r>
-            <w:r>
+              <w:rPr>
+                <w:highlight w:val="yellow"/>
+              </w:rPr>
+              <w:t xml:space="preserve">Online stores have an </w:t>
+            </w:r>
+            <w:r>
+              <w:rPr>
+                <w:b/>
+                <w:bCs/>
+                <w:highlight w:val="yellow"/>
+              </w:rPr>
+              <w:t>almost limitless inventory</w:t>
+            </w:r>
+            <w:r>
+              <w:rPr>
+                <w:highlight w:val="yellow"/>
+              </w:rPr>
               <w:t>,</w:t>
             </w:r>
             <w:r>
-              <w:t xml:space="preserve"> offering customers an unprecedented array of choices. </w:t>
+              <w:rPr>
+                <w:highlight w:val="yellow"/>
+              </w:rPr>
+              <w:t xml:space="preserve"> offering customers an </w:t>
+            </w:r>
+            <w:r>
+              <w:rPr>
+                <w:b/>
+                <w:bCs/>
+                <w:highlight w:val="yellow"/>
+              </w:rPr>
+              <w:t>unprecedented array of choices</w:t>
+            </w:r>
+            <w:r>
+              <w:t xml:space="preserve">. </w:t>
             </w:r>
             <w:r>
               <w:t>E</w:t>
@@ -1543,7 +1556,134 @@
               <w:t xml:space="preserve"> </w:t>
             </w:r>
             <w:r>
-              <w:t>Platforms like eBay and Etsy have become hubs for niche markets, satisfying the quirkiest of tastes. Variety is king, and this includes the range of information that consumers are empowered with – an endless buffet of reviews, product comparisons and price tracking. Websites like CNET and Which? allow shoppers to explore the pros and cons of virtually every product under the sun. Reviews give a voice to consumers, allowing them to share their experiences, transforming them from passive buyers into active participants and enabling everyone to shop smarter, not harder.</w:t>
+              <w:t xml:space="preserve">Platforms like eBay and Etsy have become hubs for niche markets, satisfying the quirkiest of tastes. </w:t>
+            </w:r>
+            <w:r>
+              <w:rPr>
+                <w:b/>
+                <w:bCs/>
+                <w:highlight w:val="yellow"/>
+              </w:rPr>
+              <w:t>Variety is king</w:t>
+            </w:r>
+            <w:r>
+              <w:rPr>
+                <w:highlight w:val="yellow"/>
+              </w:rPr>
+              <w:t xml:space="preserve">, and this includes the range of </w:t>
+            </w:r>
+            <w:r>
+              <w:rPr>
+                <w:b/>
+                <w:bCs/>
+                <w:highlight w:val="yellow"/>
+              </w:rPr>
+              <w:t>information that consumers are empowered</w:t>
+            </w:r>
+            <w:r>
+              <w:rPr>
+                <w:highlight w:val="yellow"/>
+              </w:rPr>
+              <w:t xml:space="preserve"> with – an </w:t>
+            </w:r>
+            <w:r>
+              <w:rPr>
+                <w:b/>
+                <w:bCs/>
+                <w:highlight w:val="yellow"/>
+              </w:rPr>
+              <w:t>endless buffet</w:t>
+            </w:r>
+            <w:r>
+              <w:rPr>
+                <w:highlight w:val="yellow"/>
+              </w:rPr>
+              <w:t xml:space="preserve"> of reviews, product comparisons and price tracking</w:t>
+            </w:r>
+            <w:r>
+              <w:t xml:space="preserve">. Websites like CNET and Which? </w:t>
+            </w:r>
+            <w:r>
+              <w:rPr>
+                <w:highlight w:val="yellow"/>
+              </w:rPr>
+              <w:t xml:space="preserve">allow shoppers to </w:t>
+            </w:r>
+            <w:r>
+              <w:rPr>
+                <w:b/>
+                <w:bCs/>
+                <w:highlight w:val="yellow"/>
+              </w:rPr>
+              <w:t>explore the pros and cons of virtually every product</w:t>
+            </w:r>
+            <w:r>
+              <w:t xml:space="preserve"> under the sun. </w:t>
+            </w:r>
+            <w:r>
+              <w:rPr>
+                <w:highlight w:val="yellow"/>
+              </w:rPr>
+              <w:t xml:space="preserve">Reviews </w:t>
+            </w:r>
+            <w:r>
+              <w:rPr>
+                <w:b/>
+                <w:bCs/>
+                <w:highlight w:val="yellow"/>
+              </w:rPr>
+              <w:t>give a voice to consumers</w:t>
+            </w:r>
+            <w:r>
+              <w:rPr>
+                <w:highlight w:val="yellow"/>
+              </w:rPr>
+              <w:t xml:space="preserve">, allowing them to </w:t>
+            </w:r>
+            <w:r>
+              <w:rPr>
+                <w:b/>
+                <w:bCs/>
+                <w:highlight w:val="yellow"/>
+              </w:rPr>
+              <w:t>share their experiences</w:t>
+            </w:r>
+            <w:r>
+              <w:rPr>
+                <w:highlight w:val="yellow"/>
+              </w:rPr>
+              <w:t xml:space="preserve">, transforming them from passive buyers into </w:t>
+            </w:r>
+            <w:r>
+              <w:rPr>
+                <w:b/>
+                <w:bCs/>
+                <w:highlight w:val="yellow"/>
+              </w:rPr>
+              <w:t>active participants</w:t>
+            </w:r>
+            <w:r>
+              <w:rPr>
+                <w:highlight w:val="yellow"/>
+              </w:rPr>
+              <w:t xml:space="preserve"> and enabling </w:t>
+            </w:r>
+            <w:r>
+              <w:rPr>
+                <w:b/>
+                <w:bCs/>
+                <w:highlight w:val="yellow"/>
+              </w:rPr>
+              <w:t>everyone to shop smarter</w:t>
+            </w:r>
+            <w:r>
+              <w:rPr>
+                <w:highlight w:val="yellow"/>
+              </w:rPr>
+              <w:t>, not harder</w:t>
+            </w:r>
+            <w:r>
+              <w:t>.</w:t>
             </w:r>
           </w:p>
           <w:p>
@@ -1666,13 +1806,125 @@
               <w:t xml:space="preserve"> i</w:t>
             </w:r>
             <w:r>
-              <w:t xml:space="preserve">s all </w:t>
-            </w:r>
-            <w:r>
-              <w:t>at your fingertips, available 24/7 and delivered to you within hours, or by the next day. The ability to shop anytime, from anywhere, means you can manage your life with less stress and more efficiency.</w:t>
-            </w:r>
-            <w:r>
-              <w:t xml:space="preserve"> People who struggle with mobility issues, lack of transportation or sensory sensitivities can shop from the comfort of their homes, finding products they need without facing physical obstacles. And with a wealth of niche products available online, people with specialised needs, be it gluten-free food or adaptive clothing, can find exactly what they are looking for</w:t>
+              <w:t xml:space="preserve">s </w:t>
+            </w:r>
+            <w:r>
+              <w:rPr>
+                <w:highlight w:val="yellow"/>
+              </w:rPr>
+              <w:t>all at your fingertips, available 24/7 and delivered to you within hours, or by the next day</w:t>
+            </w:r>
+            <w:r>
+              <w:t xml:space="preserve">. The ability to </w:t>
+            </w:r>
+            <w:r>
+              <w:rPr>
+                <w:b/>
+                <w:bCs/>
+                <w:highlight w:val="yellow"/>
+              </w:rPr>
+              <w:t>shop</w:t>
+            </w:r>
+            <w:r>
+              <w:rPr>
+                <w:highlight w:val="yellow"/>
+              </w:rPr>
+              <w:t xml:space="preserve"> </w:t>
+            </w:r>
+            <w:r>
+              <w:rPr>
+                <w:b/>
+                <w:bCs/>
+                <w:highlight w:val="yellow"/>
+              </w:rPr>
+              <w:t>anytime, from anywhere</w:t>
+            </w:r>
+            <w:r>
+              <w:rPr>
+                <w:highlight w:val="yellow"/>
+              </w:rPr>
+              <w:t xml:space="preserve">, means you can manage your life with </w:t>
+            </w:r>
+            <w:r>
+              <w:rPr>
+                <w:b/>
+                <w:bCs/>
+                <w:highlight w:val="yellow"/>
+              </w:rPr>
+              <w:t>less stress and more efficiency</w:t>
+            </w:r>
+            <w:r>
+              <w:t>.</w:t>
+            </w:r>
+            <w:r>
+              <w:t xml:space="preserve"> People who struggle with mobility issues, lack of transportation or sensory sensitivities can </w:t>
+            </w:r>
+            <w:r>
+              <w:rPr>
+                <w:highlight w:val="yellow"/>
+              </w:rPr>
+              <w:t xml:space="preserve">shop </w:t>
+            </w:r>
+            <w:r>
+              <w:rPr>
+                <w:b/>
+                <w:bCs/>
+                <w:highlight w:val="yellow"/>
+              </w:rPr>
+              <w:t>from the comfort of their homes</w:t>
+            </w:r>
+            <w:r>
+              <w:rPr>
+                <w:highlight w:val="yellow"/>
+              </w:rPr>
+              <w:t xml:space="preserve">, finding products they need </w:t>
+            </w:r>
+            <w:r>
+              <w:rPr>
+                <w:b/>
+                <w:bCs/>
+                <w:highlight w:val="yellow"/>
+              </w:rPr>
+              <w:t>without facing physical obstacles</w:t>
+            </w:r>
+            <w:r>
+              <w:t xml:space="preserve">. And with a </w:t>
+            </w:r>
+            <w:r>
+              <w:rPr>
+                <w:b/>
+                <w:bCs/>
+                <w:highlight w:val="yellow"/>
+              </w:rPr>
+              <w:t>wealth of niche products</w:t>
+            </w:r>
+            <w:r>
+              <w:rPr>
+                <w:highlight w:val="yellow"/>
+              </w:rPr>
+              <w:t xml:space="preserve"> available online, people with </w:t>
+            </w:r>
+            <w:r>
+              <w:rPr>
+                <w:b/>
+                <w:bCs/>
+                <w:highlight w:val="yellow"/>
+              </w:rPr>
+              <w:t>specialised needs</w:t>
+            </w:r>
+            <w:r>
+              <w:rPr>
+                <w:highlight w:val="yellow"/>
+              </w:rPr>
+              <w:t xml:space="preserve">, be it gluten-free food or adaptive clothing, can </w:t>
+            </w:r>
+            <w:r>
+              <w:rPr>
+                <w:b/>
+                <w:bCs/>
+                <w:highlight w:val="yellow"/>
+              </w:rPr>
+              <w:t>find exactly what they are looking for</w:t>
             </w:r>
             <w:r>
               <w:t>.</w:t>
@@ -1807,7 +2059,108 @@
               <w:jc w:val="both"/>
             </w:pPr>
             <w:r>
-              <w:t>Online shopping fuels an entire ecosystem of industries and jobs from warehouse staff to delivery drivers, web developers and digital marketers, and spurs innovations in logistics and technology. Artificial intelligence and machine learning in retail help companies anticipate consumer demand, personalise recommendations and streamline inventory management. Rent, utilities and staff can often make the dream of entrepreneurship a financial mountain too high to climb. But with platforms like Shopify and Etsy, anyone with a good idea and an internet connection can start a business. In short, e-commerce has become an engine of economic growth.</w:t>
+              <w:t xml:space="preserve">Online shopping </w:t>
+            </w:r>
+            <w:r>
+              <w:rPr>
+                <w:b/>
+                <w:bCs/>
+                <w:highlight w:val="yellow"/>
+              </w:rPr>
+              <w:t>fuels an entire ecosystem of industries and jobs</w:t>
+            </w:r>
+            <w:r>
+              <w:t xml:space="preserve"> from warehouse staff to delivery drivers, web developers and digital marketers, and </w:t>
+            </w:r>
+            <w:r>
+              <w:rPr>
+                <w:b/>
+                <w:bCs/>
+                <w:highlight w:val="yellow"/>
+              </w:rPr>
+              <w:t>spurs innovations in logistics and technology</w:t>
+            </w:r>
+            <w:r>
+              <w:t xml:space="preserve">. </w:t>
+            </w:r>
+            <w:r>
+              <w:rPr>
+                <w:highlight w:val="yellow"/>
+              </w:rPr>
+              <w:t xml:space="preserve">Artificial intelligence and machine learning in retail help </w:t>
+            </w:r>
+            <w:r>
+              <w:rPr>
+                <w:b/>
+                <w:bCs/>
+                <w:highlight w:val="yellow"/>
+              </w:rPr>
+              <w:t>companies anticipate consumer demand</w:t>
+            </w:r>
+            <w:r>
+              <w:rPr>
+                <w:highlight w:val="yellow"/>
+              </w:rPr>
+              <w:t xml:space="preserve">, </w:t>
+            </w:r>
+            <w:r>
+              <w:rPr>
+                <w:b/>
+                <w:bCs/>
+                <w:highlight w:val="yellow"/>
+              </w:rPr>
+              <w:t>personalise recommendation</w:t>
+            </w:r>
+            <w:r>
+              <w:rPr>
+                <w:highlight w:val="yellow"/>
+              </w:rPr>
+              <w:t xml:space="preserve">s and </w:t>
+            </w:r>
+            <w:r>
+              <w:rPr>
+                <w:b/>
+                <w:bCs/>
+                <w:highlight w:val="yellow"/>
+              </w:rPr>
+              <w:t>streamline inventory management</w:t>
+            </w:r>
+            <w:r>
+              <w:t xml:space="preserve">. </w:t>
+            </w:r>
+            <w:r>
+              <w:rPr>
+                <w:b/>
+                <w:bCs/>
+                <w:highlight w:val="yellow"/>
+              </w:rPr>
+              <w:t>Rent, utilities and staff</w:t>
+            </w:r>
+            <w:r>
+              <w:rPr>
+                <w:highlight w:val="yellow"/>
+              </w:rPr>
+              <w:t xml:space="preserve"> can often make the dream of entrepreneurship a financial mountain too high to climb. But with platforms like Shopify and Etsy, </w:t>
+            </w:r>
+            <w:r>
+              <w:rPr>
+                <w:b/>
+                <w:bCs/>
+                <w:highlight w:val="yellow"/>
+              </w:rPr>
+              <w:t>anyone with a good idea and an internet connection can start a business</w:t>
+            </w:r>
+            <w:r>
+              <w:t xml:space="preserve">. In short, e-commerce has become an </w:t>
+            </w:r>
+            <w:r>
+              <w:rPr>
+                <w:highlight w:val="yellow"/>
+              </w:rPr>
+              <w:t>engine of economic growth</w:t>
+            </w:r>
+            <w:r>
+              <w:t>.</w:t>
             </w:r>
           </w:p>
           <w:p>
@@ -1977,27 +2330,89 @@
               <w:jc w:val="both"/>
             </w:pPr>
             <w:r>
-              <w:t xml:space="preserve">Online shopping can </w:t>
-            </w:r>
-            <w:proofErr w:type="gramStart"/>
-            <w:r>
-              <w:t>actually be</w:t>
-            </w:r>
-            <w:proofErr w:type="gramEnd"/>
-            <w:r>
-              <w:t xml:space="preserve"> better for the environment. Individual trips to physical stores are reduced, helping to cut down emissions. </w:t>
-            </w:r>
-            <w:r>
-              <w:t>Many companies now embrace sustainable packaging and carbon-neutral delivery option</w:t>
-            </w:r>
-            <w:r>
-              <w:t>s.</w:t>
+              <w:t xml:space="preserve">Online shopping can actually be </w:t>
+            </w:r>
+            <w:r>
+              <w:rPr>
+                <w:b/>
+                <w:bCs/>
+                <w:highlight w:val="yellow"/>
+              </w:rPr>
+              <w:t>better for the environment</w:t>
+            </w:r>
+            <w:r>
+              <w:rPr>
+                <w:highlight w:val="yellow"/>
+              </w:rPr>
+              <w:t xml:space="preserve">. Individual </w:t>
+            </w:r>
+            <w:r>
+              <w:rPr>
+                <w:b/>
+                <w:bCs/>
+                <w:highlight w:val="yellow"/>
+              </w:rPr>
+              <w:t>trips to physical stores are reduce</w:t>
+            </w:r>
+            <w:r>
+              <w:rPr>
+                <w:highlight w:val="yellow"/>
+              </w:rPr>
+              <w:t>d, helping to cut down emissions.</w:t>
             </w:r>
             <w:r>
               <w:t xml:space="preserve"> </w:t>
             </w:r>
             <w:r>
-              <w:t>By leveraging digital tools, businesses can track consumer demand in real time, ensuring that goods are produced only when needed.</w:t>
+              <w:t xml:space="preserve">Many companies now embrace </w:t>
+            </w:r>
+            <w:r>
+              <w:rPr>
+                <w:b/>
+                <w:bCs/>
+                <w:highlight w:val="yellow"/>
+              </w:rPr>
+              <w:t>sustainable packaging</w:t>
+            </w:r>
+            <w:r>
+              <w:rPr>
+                <w:highlight w:val="yellow"/>
+              </w:rPr>
+              <w:t xml:space="preserve"> and </w:t>
+            </w:r>
+            <w:r>
+              <w:rPr>
+                <w:b/>
+                <w:bCs/>
+                <w:highlight w:val="yellow"/>
+              </w:rPr>
+              <w:t>carbon-neutral delivery options</w:t>
+            </w:r>
+            <w:r>
+              <w:t>.</w:t>
+            </w:r>
+            <w:r>
+              <w:t xml:space="preserve"> </w:t>
+            </w:r>
+            <w:r>
+              <w:t xml:space="preserve">By leveraging digital tools, businesses can </w:t>
+            </w:r>
+            <w:r>
+              <w:rPr>
+                <w:highlight w:val="yellow"/>
+              </w:rPr>
+              <w:t xml:space="preserve">track consumer demand in real time, ensuring that </w:t>
+            </w:r>
+            <w:r>
+              <w:rPr>
+                <w:b/>
+                <w:bCs/>
+                <w:highlight w:val="yellow"/>
+              </w:rPr>
+              <w:t>goods are produced only when needed</w:t>
+            </w:r>
+            <w:r>
+              <w:t>.</w:t>
             </w:r>
           </w:p>
         </w:tc>
@@ -2353,7 +2768,11 @@
           </mc:Choice>
           <mc:Fallback>
             <w:pict>
-              <v:shape w14:anchorId="0DC2C5CB" id="Text Box 1572675231" o:spid="_x0000_s1027" type="#_x0000_t202" style="position:absolute;margin-left:415.9pt;margin-top:24pt;width:90pt;height:27pt;z-index:251662336;visibility:visible;mso-wrap-style:square;mso-width-percent:0;mso-height-percent:0;mso-wrap-distance-left:9pt;mso-wrap-distance-top:0;mso-wrap-distance-right:9pt;mso-wrap-distance-bottom:0;mso-position-horizontal:absolute;mso-position-horizontal-relative:margin;mso-position-vertical:absolute;mso-position-vertical-relative:text;mso-width-percent:0;mso-height-percent:0;mso-width-relative:page;mso-height-relative:page;v-text-anchor:top" o:gfxdata="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" filled="f" stroked="f">
+              <v:shapetype w14:anchorId="0DC2C5CB" id="_x0000_t202" coordsize="21600,21600" o:spt="202" path="m,l,21600r21600,l21600,xe">
+                <v:stroke joinstyle="miter"/>
+                <v:path gradientshapeok="t" o:connecttype="rect"/>
+              </v:shapetype>
+              <v:shape id="Text Box 1572675231" o:spid="_x0000_s1026" type="#_x0000_t202" style="position:absolute;margin-left:415.9pt;margin-top:24pt;width:90pt;height:27pt;z-index:251662336;visibility:visible;mso-wrap-style:square;mso-width-percent:0;mso-height-percent:0;mso-wrap-distance-left:9pt;mso-wrap-distance-top:0;mso-wrap-distance-right:9pt;mso-wrap-distance-bottom:0;mso-position-horizontal:absolute;mso-position-horizontal-relative:margin;mso-position-vertical:absolute;mso-position-vertical-relative:text;mso-width-percent:0;mso-height-percent:0;mso-width-relative:page;mso-height-relative:page;v-text-anchor:top" o:gfxdata="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" filled="f" stroked="f">
                 <v:textbox>
                   <w:txbxContent>
                     <w:p>
@@ -2721,15 +3140,7 @@
               <w:jc w:val="both"/>
             </w:pPr>
             <w:r>
-              <w:t xml:space="preserve">Then, a few years ago, I decided to stop. From now on, I would shop only in </w:t>
-            </w:r>
-            <w:proofErr w:type="gramStart"/>
-            <w:r>
-              <w:t>person</w:t>
-            </w:r>
-            <w:proofErr w:type="gramEnd"/>
-            <w:r>
-              <w:t xml:space="preserve"> and I would only buy clothes I really, truly loved on me – as they were, and as I was.</w:t>
+              <w:t>Then, a few years ago, I decided to stop. From now on, I would shop only in person and I would only buy clothes I really, truly loved on me – as they were, and as I was.</w:t>
             </w:r>
             <w:r>
               <w:t xml:space="preserve"> </w:t>
@@ -2946,7 +3357,7 @@
 </file>
 
 <file path=word/endnotes.xml><?xml version="1.0" encoding="utf-8"?>
-<w:endnotes xmlns:wpc="http://schemas.microsoft.com/office/word/2010/wordprocessingCanvas" xmlns:cx="http://schemas.microsoft.com/office/drawing/2014/chartex" xmlns:cx1="http://schemas.microsoft.com/office/drawing/2015/9/8/chartex" xmlns:cx2="http://schemas.microsoft.com/office/drawing/2015/10/21/chartex" xmlns:cx3="http://schemas.microsoft.com/office/drawing/2016/5/9/chartex" xmlns:cx4="http://schemas.microsoft.com/office/drawing/2016/5/10/chartex" xmlns:cx5="http://schemas.microsoft.com/office/drawing/2016/5/11/chartex" xmlns:cx6="http://schemas.microsoft.com/office/drawing/2016/5/12/chartex" xmlns:cx7="http://schemas.microsoft.com/office/drawing/2016/5/13/chartex" xmlns:cx8="http://schemas.microsoft.com/office/drawing/2016/5/14/chartex" xmlns:mc="http://schemas.openxmlformats.org/markup-compatibility/2006" xmlns:m="http://schemas.openxmlformats.org/officeDocument/2006/math" xmlns:aink="http://schemas.microsoft.com/office/drawing/2016/ink" xmlns:am3d="http://schemas.microsoft.com/office/drawing/2017/model3d" xmlns:oel="http://schemas.microsoft.com/office/2019/extlst" xmlns:r="http://schemas.openxmlformats.org/officeDocument/2006/relationships" xmlns:wp14="http://schemas.microsoft.com/office/word/2010/wordprocessingDrawing" xmlns:wp="http://schemas.openxmlformats.org/drawingml/2006/wordprocessingDrawing" xmlns:wpg="http://schemas.microsoft.com/office/word/2010/wordprocessingGroup" xmlns:wpi="http://schemas.microsoft.com/office/word/2010/wordprocessingInk" xmlns:wps="http://schemas.microsoft.com/office/word/2010/wordprocessingShape" xmlns:o="urn:schemas-microsoft-com:office:office" xmlns:v="urn:schemas-microsoft-com:vml" xmlns:w10="urn:schemas-microsoft-com:office:word" xmlns:w="http://schemas.openxmlformats.org/wordprocessingml/2006/main" xmlns:w14="http://schemas.microsoft.com/office/word/2010/wordml" xmlns:w15="http://schemas.microsoft.com/office/word/2012/wordml" xmlns:w16cex="http://schemas.microsoft.com/office/word/2018/wordml/cex" xmlns:w16cid="http://schemas.microsoft.com/office/word/2016/wordml/cid" xmlns:w16="http://schemas.microsoft.com/office/word/2018/wordml" xmlns:w16sdtdh="http://schemas.microsoft.com/office/word/2020/wordml/sdtdatahash" xmlns:w16sdtfl="http://schemas.microsoft.com/office/word/2024/wordml/sdtformatlock" xmlns:w16se="http://schemas.microsoft.com/office/word/2015/wordml/symex" xmlns:w16du="http://schemas.microsoft.com/office/word/2023/wordml/word16du" xmlns:wne="http://schemas.microsoft.com/office/word/2006/wordml" mc:Ignorable="w14 w15 w16se w16cid w16 w16cex w16sdtdh w16sdtfl w16du wp14">
+<w:endnotes xmlns:wpc="http://schemas.microsoft.com/office/word/2010/wordprocessingCanvas" xmlns:cx="http://schemas.microsoft.com/office/drawing/2014/chartex" xmlns:cx1="http://schemas.microsoft.com/office/drawing/2015/9/8/chartex" xmlns:cx2="http://schemas.microsoft.com/office/drawing/2015/10/21/chartex" xmlns:cx3="http://schemas.microsoft.com/office/drawing/2016/5/9/chartex" xmlns:cx4="http://schemas.microsoft.com/office/drawing/2016/5/10/chartex" xmlns:cx5="http://schemas.microsoft.com/office/drawing/2016/5/11/chartex" xmlns:cx6="http://schemas.microsoft.com/office/drawing/2016/5/12/chartex" xmlns:cx7="http://schemas.microsoft.com/office/drawing/2016/5/13/chartex" xmlns:cx8="http://schemas.microsoft.com/office/drawing/2016/5/14/chartex" xmlns:mc="http://schemas.openxmlformats.org/markup-compatibility/2006" xmlns:aink="http://schemas.microsoft.com/office/drawing/2016/ink" xmlns:am3d="http://schemas.microsoft.com/office/drawing/2017/model3d" xmlns:o="urn:schemas-microsoft-com:office:office" xmlns:oel="http://schemas.microsoft.com/office/2019/extlst" xmlns:r="http://schemas.openxmlformats.org/officeDocument/2006/relationships" xmlns:m="http://schemas.openxmlformats.org/officeDocument/2006/math" xmlns:v="urn:schemas-microsoft-com:vml" xmlns:wp14="http://schemas.microsoft.com/office/word/2010/wordprocessingDrawing" xmlns:wp="http://schemas.openxmlformats.org/drawingml/2006/wordprocessingDrawing" xmlns:w10="urn:schemas-microsoft-com:office:word" xmlns:w="http://schemas.openxmlformats.org/wordprocessingml/2006/main" xmlns:w14="http://schemas.microsoft.com/office/word/2010/wordml" xmlns:w15="http://schemas.microsoft.com/office/word/2012/wordml" xmlns:w16cex="http://schemas.microsoft.com/office/word/2018/wordml/cex" xmlns:w16cid="http://schemas.microsoft.com/office/word/2016/wordml/cid" xmlns:w16="http://schemas.microsoft.com/office/word/2018/wordml" xmlns:w16du="http://schemas.microsoft.com/office/word/2023/wordml/word16du" xmlns:w16sdtdh="http://schemas.microsoft.com/office/word/2020/wordml/sdtdatahash" xmlns:w16sdtfl="http://schemas.microsoft.com/office/word/2024/wordml/sdtformatlock" xmlns:w16se="http://schemas.microsoft.com/office/word/2015/wordml/symex" xmlns:wpg="http://schemas.microsoft.com/office/word/2010/wordprocessingGroup" xmlns:wpi="http://schemas.microsoft.com/office/word/2010/wordprocessingInk" xmlns:wne="http://schemas.microsoft.com/office/word/2006/wordml" xmlns:wps="http://schemas.microsoft.com/office/word/2010/wordprocessingShape" mc:Ignorable="w14 w15 w16se w16cid w16 w16cex w16sdtdh w16sdtfl w16du wp14">
   <w:endnote w:type="separator" w:id="-1">
     <w:p>
       <w:r>
@@ -2965,7 +3376,7 @@
 </file>
 
 <file path=word/footer1.xml><?xml version="1.0" encoding="utf-8"?>
-<w:ftr xmlns:wpc="http://schemas.microsoft.com/office/word/2010/wordprocessingCanvas" xmlns:cx="http://schemas.microsoft.com/office/drawing/2014/chartex" xmlns:cx1="http://schemas.microsoft.com/office/drawing/2015/9/8/chartex" xmlns:cx2="http://schemas.microsoft.com/office/drawing/2015/10/21/chartex" xmlns:cx3="http://schemas.microsoft.com/office/drawing/2016/5/9/chartex" xmlns:cx4="http://schemas.microsoft.com/office/drawing/2016/5/10/chartex" xmlns:cx5="http://schemas.microsoft.com/office/drawing/2016/5/11/chartex" xmlns:cx6="http://schemas.microsoft.com/office/drawing/2016/5/12/chartex" xmlns:cx7="http://schemas.microsoft.com/office/drawing/2016/5/13/chartex" xmlns:cx8="http://schemas.microsoft.com/office/drawing/2016/5/14/chartex" xmlns:mc="http://schemas.openxmlformats.org/markup-compatibility/2006" xmlns:m="http://schemas.openxmlformats.org/officeDocument/2006/math" xmlns:aink="http://schemas.microsoft.com/office/drawing/2016/ink" xmlns:am3d="http://schemas.microsoft.com/office/drawing/2017/model3d" xmlns:oel="http://schemas.microsoft.com/office/2019/extlst" xmlns:r="http://schemas.openxmlformats.org/officeDocument/2006/relationships" xmlns:wp14="http://schemas.microsoft.com/office/word/2010/wordprocessingDrawing" xmlns:wp="http://schemas.openxmlformats.org/drawingml/2006/wordprocessingDrawing" xmlns:wpg="http://schemas.microsoft.com/office/word/2010/wordprocessingGroup" xmlns:wpi="http://schemas.microsoft.com/office/word/2010/wordprocessingInk" xmlns:wps="http://schemas.microsoft.com/office/word/2010/wordprocessingShape" xmlns:o="urn:schemas-microsoft-com:office:office" xmlns:v="urn:schemas-microsoft-com:vml" xmlns:w10="urn:schemas-microsoft-com:office:word" xmlns:w="http://schemas.openxmlformats.org/wordprocessingml/2006/main" xmlns:w14="http://schemas.microsoft.com/office/word/2010/wordml" xmlns:w15="http://schemas.microsoft.com/office/word/2012/wordml" xmlns:w16cex="http://schemas.microsoft.com/office/word/2018/wordml/cex" xmlns:w16cid="http://schemas.microsoft.com/office/word/2016/wordml/cid" xmlns:w16="http://schemas.microsoft.com/office/word/2018/wordml" xmlns:w16sdtdh="http://schemas.microsoft.com/office/word/2020/wordml/sdtdatahash" xmlns:w16sdtfl="http://schemas.microsoft.com/office/word/2024/wordml/sdtformatlock" xmlns:w16se="http://schemas.microsoft.com/office/word/2015/wordml/symex" xmlns:w16du="http://schemas.microsoft.com/office/word/2023/wordml/word16du" xmlns:wne="http://schemas.microsoft.com/office/word/2006/wordml" mc:Ignorable="w14 w15 w16se w16cid w16 w16cex w16sdtdh w16sdtfl w16du wp14">
+<w:ftr xmlns:wpc="http://schemas.microsoft.com/office/word/2010/wordprocessingCanvas" xmlns:cx="http://schemas.microsoft.com/office/drawing/2014/chartex" xmlns:cx1="http://schemas.microsoft.com/office/drawing/2015/9/8/chartex" xmlns:cx2="http://schemas.microsoft.com/office/drawing/2015/10/21/chartex" xmlns:cx3="http://schemas.microsoft.com/office/drawing/2016/5/9/chartex" xmlns:cx4="http://schemas.microsoft.com/office/drawing/2016/5/10/chartex" xmlns:cx5="http://schemas.microsoft.com/office/drawing/2016/5/11/chartex" xmlns:cx6="http://schemas.microsoft.com/office/drawing/2016/5/12/chartex" xmlns:cx7="http://schemas.microsoft.com/office/drawing/2016/5/13/chartex" xmlns:cx8="http://schemas.microsoft.com/office/drawing/2016/5/14/chartex" xmlns:mc="http://schemas.openxmlformats.org/markup-compatibility/2006" xmlns:aink="http://schemas.microsoft.com/office/drawing/2016/ink" xmlns:am3d="http://schemas.microsoft.com/office/drawing/2017/model3d" xmlns:o="urn:schemas-microsoft-com:office:office" xmlns:oel="http://schemas.microsoft.com/office/2019/extlst" xmlns:r="http://schemas.openxmlformats.org/officeDocument/2006/relationships" xmlns:m="http://schemas.openxmlformats.org/officeDocument/2006/math" xmlns:v="urn:schemas-microsoft-com:vml" xmlns:wp14="http://schemas.microsoft.com/office/word/2010/wordprocessingDrawing" xmlns:wp="http://schemas.openxmlformats.org/drawingml/2006/wordprocessingDrawing" xmlns:w10="urn:schemas-microsoft-com:office:word" xmlns:w="http://schemas.openxmlformats.org/wordprocessingml/2006/main" xmlns:w14="http://schemas.microsoft.com/office/word/2010/wordml" xmlns:w15="http://schemas.microsoft.com/office/word/2012/wordml" xmlns:w16cex="http://schemas.microsoft.com/office/word/2018/wordml/cex" xmlns:w16cid="http://schemas.microsoft.com/office/word/2016/wordml/cid" xmlns:w16="http://schemas.microsoft.com/office/word/2018/wordml" xmlns:w16du="http://schemas.microsoft.com/office/word/2023/wordml/word16du" xmlns:w16sdtdh="http://schemas.microsoft.com/office/word/2020/wordml/sdtdatahash" xmlns:w16sdtfl="http://schemas.microsoft.com/office/word/2024/wordml/sdtformatlock" xmlns:w16se="http://schemas.microsoft.com/office/word/2015/wordml/symex" xmlns:wpg="http://schemas.microsoft.com/office/word/2010/wordprocessingGroup" xmlns:wpi="http://schemas.microsoft.com/office/word/2010/wordprocessingInk" xmlns:wne="http://schemas.microsoft.com/office/word/2006/wordml" xmlns:wps="http://schemas.microsoft.com/office/word/2010/wordprocessingShape" mc:Ignorable="w14 w15 w16se w16cid w16 w16cex w16sdtdh w16sdtfl w16du wp14">
   <w:p>
     <w:pPr>
       <w:pStyle w:val="Footer"/>
@@ -3002,7 +3413,7 @@
 </file>
 
 <file path=word/footnotes.xml><?xml version="1.0" encoding="utf-8"?>
-<w:footnotes xmlns:wpc="http://schemas.microsoft.com/office/word/2010/wordprocessingCanvas" xmlns:cx="http://schemas.microsoft.com/office/drawing/2014/chartex" xmlns:cx1="http://schemas.microsoft.com/office/drawing/2015/9/8/chartex" xmlns:cx2="http://schemas.microsoft.com/office/drawing/2015/10/21/chartex" xmlns:cx3="http://schemas.microsoft.com/office/drawing/2016/5/9/chartex" xmlns:cx4="http://schemas.microsoft.com/office/drawing/2016/5/10/chartex" xmlns:cx5="http://schemas.microsoft.com/office/drawing/2016/5/11/chartex" xmlns:cx6="http://schemas.microsoft.com/office/drawing/2016/5/12/chartex" xmlns:cx7="http://schemas.microsoft.com/office/drawing/2016/5/13/chartex" xmlns:cx8="http://schemas.microsoft.com/office/drawing/2016/5/14/chartex" xmlns:mc="http://schemas.openxmlformats.org/markup-compatibility/2006" xmlns:m="http://schemas.openxmlformats.org/officeDocument/2006/math" xmlns:aink="http://schemas.microsoft.com/office/drawing/2016/ink" xmlns:am3d="http://schemas.microsoft.com/office/drawing/2017/model3d" xmlns:oel="http://schemas.microsoft.com/office/2019/extlst" xmlns:r="http://schemas.openxmlformats.org/officeDocument/2006/relationships" xmlns:wp14="http://schemas.microsoft.com/office/word/2010/wordprocessingDrawing" xmlns:wp="http://schemas.openxmlformats.org/drawingml/2006/wordprocessingDrawing" xmlns:wpg="http://schemas.microsoft.com/office/word/2010/wordprocessingGroup" xmlns:wpi="http://schemas.microsoft.com/office/word/2010/wordprocessingInk" xmlns:wps="http://schemas.microsoft.com/office/word/2010/wordprocessingShape" xmlns:o="urn:schemas-microsoft-com:office:office" xmlns:v="urn:schemas-microsoft-com:vml" xmlns:w10="urn:schemas-microsoft-com:office:word" xmlns:w="http://schemas.openxmlformats.org/wordprocessingml/2006/main" xmlns:w14="http://schemas.microsoft.com/office/word/2010/wordml" xmlns:w15="http://schemas.microsoft.com/office/word/2012/wordml" xmlns:w16cex="http://schemas.microsoft.com/office/word/2018/wordml/cex" xmlns:w16cid="http://schemas.microsoft.com/office/word/2016/wordml/cid" xmlns:w16="http://schemas.microsoft.com/office/word/2018/wordml" xmlns:w16sdtdh="http://schemas.microsoft.com/office/word/2020/wordml/sdtdatahash" xmlns:w16sdtfl="http://schemas.microsoft.com/office/word/2024/wordml/sdtformatlock" xmlns:w16se="http://schemas.microsoft.com/office/word/2015/wordml/symex" xmlns:w16du="http://schemas.microsoft.com/office/word/2023/wordml/word16du" xmlns:wne="http://schemas.microsoft.com/office/word/2006/wordml" mc:Ignorable="w14 w15 w16se w16cid w16 w16cex w16sdtdh w16sdtfl w16du wp14">
+<w:footnotes xmlns:wpc="http://schemas.microsoft.com/office/word/2010/wordprocessingCanvas" xmlns:cx="http://schemas.microsoft.com/office/drawing/2014/chartex" xmlns:cx1="http://schemas.microsoft.com/office/drawing/2015/9/8/chartex" xmlns:cx2="http://schemas.microsoft.com/office/drawing/2015/10/21/chartex" xmlns:cx3="http://schemas.microsoft.com/office/drawing/2016/5/9/chartex" xmlns:cx4="http://schemas.microsoft.com/office/drawing/2016/5/10/chartex" xmlns:cx5="http://schemas.microsoft.com/office/drawing/2016/5/11/chartex" xmlns:cx6="http://schemas.microsoft.com/office/drawing/2016/5/12/chartex" xmlns:cx7="http://schemas.microsoft.com/office/drawing/2016/5/13/chartex" xmlns:cx8="http://schemas.microsoft.com/office/drawing/2016/5/14/chartex" xmlns:mc="http://schemas.openxmlformats.org/markup-compatibility/2006" xmlns:aink="http://schemas.microsoft.com/office/drawing/2016/ink" xmlns:am3d="http://schemas.microsoft.com/office/drawing/2017/model3d" xmlns:o="urn:schemas-microsoft-com:office:office" xmlns:oel="http://schemas.microsoft.com/office/2019/extlst" xmlns:r="http://schemas.openxmlformats.org/officeDocument/2006/relationships" xmlns:m="http://schemas.openxmlformats.org/officeDocument/2006/math" xmlns:v="urn:schemas-microsoft-com:vml" xmlns:wp14="http://schemas.microsoft.com/office/word/2010/wordprocessingDrawing" xmlns:wp="http://schemas.openxmlformats.org/drawingml/2006/wordprocessingDrawing" xmlns:w10="urn:schemas-microsoft-com:office:word" xmlns:w="http://schemas.openxmlformats.org/wordprocessingml/2006/main" xmlns:w14="http://schemas.microsoft.com/office/word/2010/wordml" xmlns:w15="http://schemas.microsoft.com/office/word/2012/wordml" xmlns:w16cex="http://schemas.microsoft.com/office/word/2018/wordml/cex" xmlns:w16cid="http://schemas.microsoft.com/office/word/2016/wordml/cid" xmlns:w16="http://schemas.microsoft.com/office/word/2018/wordml" xmlns:w16du="http://schemas.microsoft.com/office/word/2023/wordml/word16du" xmlns:w16sdtdh="http://schemas.microsoft.com/office/word/2020/wordml/sdtdatahash" xmlns:w16sdtfl="http://schemas.microsoft.com/office/word/2024/wordml/sdtformatlock" xmlns:w16se="http://schemas.microsoft.com/office/word/2015/wordml/symex" xmlns:wpg="http://schemas.microsoft.com/office/word/2010/wordprocessingGroup" xmlns:wpi="http://schemas.microsoft.com/office/word/2010/wordprocessingInk" xmlns:wne="http://schemas.microsoft.com/office/word/2006/wordml" xmlns:wps="http://schemas.microsoft.com/office/word/2010/wordprocessingShape" mc:Ignorable="w14 w15 w16se w16cid w16 w16cex w16sdtdh w16sdtfl w16du wp14">
   <w:footnote w:type="separator" w:id="-1">
     <w:p>
       <w:r>
@@ -3021,7 +3432,7 @@
 </file>
 
 <file path=word/header1.xml><?xml version="1.0" encoding="utf-8"?>
-<w:hdr xmlns:wpc="http://schemas.microsoft.com/office/word/2010/wordprocessingCanvas" xmlns:cx="http://schemas.microsoft.com/office/drawing/2014/chartex" xmlns:cx1="http://schemas.microsoft.com/office/drawing/2015/9/8/chartex" xmlns:cx2="http://schemas.microsoft.com/office/drawing/2015/10/21/chartex" xmlns:cx3="http://schemas.microsoft.com/office/drawing/2016/5/9/chartex" xmlns:cx4="http://schemas.microsoft.com/office/drawing/2016/5/10/chartex" xmlns:cx5="http://schemas.microsoft.com/office/drawing/2016/5/11/chartex" xmlns:cx6="http://schemas.microsoft.com/office/drawing/2016/5/12/chartex" xmlns:cx7="http://schemas.microsoft.com/office/drawing/2016/5/13/chartex" xmlns:cx8="http://schemas.microsoft.com/office/drawing/2016/5/14/chartex" xmlns:mc="http://schemas.openxmlformats.org/markup-compatibility/2006" xmlns:m="http://schemas.openxmlformats.org/officeDocument/2006/math" xmlns:aink="http://schemas.microsoft.com/office/drawing/2016/ink" xmlns:am3d="http://schemas.microsoft.com/office/drawing/2017/model3d" xmlns:oel="http://schemas.microsoft.com/office/2019/extlst" xmlns:r="http://schemas.openxmlformats.org/officeDocument/2006/relationships" xmlns:wp14="http://schemas.microsoft.com/office/word/2010/wordprocessingDrawing" xmlns:wp="http://schemas.openxmlformats.org/drawingml/2006/wordprocessingDrawing" xmlns:wpg="http://schemas.microsoft.com/office/word/2010/wordprocessingGroup" xmlns:wpi="http://schemas.microsoft.com/office/word/2010/wordprocessingInk" xmlns:wps="http://schemas.microsoft.com/office/word/2010/wordprocessingShape" xmlns:o="urn:schemas-microsoft-com:office:office" xmlns:v="urn:schemas-microsoft-com:vml" xmlns:w10="urn:schemas-microsoft-com:office:word" xmlns:w="http://schemas.openxmlformats.org/wordprocessingml/2006/main" xmlns:w14="http://schemas.microsoft.com/office/word/2010/wordml" xmlns:w15="http://schemas.microsoft.com/office/word/2012/wordml" xmlns:w16cex="http://schemas.microsoft.com/office/word/2018/wordml/cex" xmlns:w16cid="http://schemas.microsoft.com/office/word/2016/wordml/cid" xmlns:w16="http://schemas.microsoft.com/office/word/2018/wordml" xmlns:w16sdtdh="http://schemas.microsoft.com/office/word/2020/wordml/sdtdatahash" xmlns:w16sdtfl="http://schemas.microsoft.com/office/word/2024/wordml/sdtformatlock" xmlns:w16se="http://schemas.microsoft.com/office/word/2015/wordml/symex" xmlns:w16du="http://schemas.microsoft.com/office/word/2023/wordml/word16du" xmlns:wne="http://schemas.microsoft.com/office/word/2006/wordml" mc:Ignorable="w14 w15 w16se w16cid w16 w16cex w16sdtdh w16sdtfl w16du wp14">
+<w:hdr xmlns:wpc="http://schemas.microsoft.com/office/word/2010/wordprocessingCanvas" xmlns:cx="http://schemas.microsoft.com/office/drawing/2014/chartex" xmlns:cx1="http://schemas.microsoft.com/office/drawing/2015/9/8/chartex" xmlns:cx2="http://schemas.microsoft.com/office/drawing/2015/10/21/chartex" xmlns:cx3="http://schemas.microsoft.com/office/drawing/2016/5/9/chartex" xmlns:cx4="http://schemas.microsoft.com/office/drawing/2016/5/10/chartex" xmlns:cx5="http://schemas.microsoft.com/office/drawing/2016/5/11/chartex" xmlns:cx6="http://schemas.microsoft.com/office/drawing/2016/5/12/chartex" xmlns:cx7="http://schemas.microsoft.com/office/drawing/2016/5/13/chartex" xmlns:cx8="http://schemas.microsoft.com/office/drawing/2016/5/14/chartex" xmlns:mc="http://schemas.openxmlformats.org/markup-compatibility/2006" xmlns:aink="http://schemas.microsoft.com/office/drawing/2016/ink" xmlns:am3d="http://schemas.microsoft.com/office/drawing/2017/model3d" xmlns:o="urn:schemas-microsoft-com:office:office" xmlns:oel="http://schemas.microsoft.com/office/2019/extlst" xmlns:r="http://schemas.openxmlformats.org/officeDocument/2006/relationships" xmlns:m="http://schemas.openxmlformats.org/officeDocument/2006/math" xmlns:v="urn:schemas-microsoft-com:vml" xmlns:wp14="http://schemas.microsoft.com/office/word/2010/wordprocessingDrawing" xmlns:wp="http://schemas.openxmlformats.org/drawingml/2006/wordprocessingDrawing" xmlns:w10="urn:schemas-microsoft-com:office:word" xmlns:w="http://schemas.openxmlformats.org/wordprocessingml/2006/main" xmlns:w14="http://schemas.microsoft.com/office/word/2010/wordml" xmlns:w15="http://schemas.microsoft.com/office/word/2012/wordml" xmlns:w16cex="http://schemas.microsoft.com/office/word/2018/wordml/cex" xmlns:w16cid="http://schemas.microsoft.com/office/word/2016/wordml/cid" xmlns:w16="http://schemas.microsoft.com/office/word/2018/wordml" xmlns:w16du="http://schemas.microsoft.com/office/word/2023/wordml/word16du" xmlns:w16sdtdh="http://schemas.microsoft.com/office/word/2020/wordml/sdtdatahash" xmlns:w16sdtfl="http://schemas.microsoft.com/office/word/2024/wordml/sdtformatlock" xmlns:w16se="http://schemas.microsoft.com/office/word/2015/wordml/symex" xmlns:wpg="http://schemas.microsoft.com/office/word/2010/wordprocessingGroup" xmlns:wpi="http://schemas.microsoft.com/office/word/2010/wordprocessingInk" xmlns:wne="http://schemas.microsoft.com/office/word/2006/wordml" xmlns:wps="http://schemas.microsoft.com/office/word/2010/wordprocessingShape" mc:Ignorable="w14 w15 w16se w16cid w16 w16cex w16sdtdh w16sdtfl w16du wp14">
   <w:p>
     <w:pPr>
       <w:pStyle w:val="Header"/>
@@ -3058,7 +3469,7 @@
 </file>
 
 <file path=word/header2.xml><?xml version="1.0" encoding="utf-8"?>
-<w:hdr xmlns:wpc="http://schemas.microsoft.com/office/word/2010/wordprocessingCanvas" xmlns:cx="http://schemas.microsoft.com/office/drawing/2014/chartex" xmlns:cx1="http://schemas.microsoft.com/office/drawing/2015/9/8/chartex" xmlns:cx2="http://schemas.microsoft.com/office/drawing/2015/10/21/chartex" xmlns:cx3="http://schemas.microsoft.com/office/drawing/2016/5/9/chartex" xmlns:cx4="http://schemas.microsoft.com/office/drawing/2016/5/10/chartex" xmlns:cx5="http://schemas.microsoft.com/office/drawing/2016/5/11/chartex" xmlns:cx6="http://schemas.microsoft.com/office/drawing/2016/5/12/chartex" xmlns:cx7="http://schemas.microsoft.com/office/drawing/2016/5/13/chartex" xmlns:cx8="http://schemas.microsoft.com/office/drawing/2016/5/14/chartex" xmlns:mc="http://schemas.openxmlformats.org/markup-compatibility/2006" xmlns:m="http://schemas.openxmlformats.org/officeDocument/2006/math" xmlns:aink="http://schemas.microsoft.com/office/drawing/2016/ink" xmlns:am3d="http://schemas.microsoft.com/office/drawing/2017/model3d" xmlns:oel="http://schemas.microsoft.com/office/2019/extlst" xmlns:r="http://schemas.openxmlformats.org/officeDocument/2006/relationships" xmlns:wp14="http://schemas.microsoft.com/office/word/2010/wordprocessingDrawing" xmlns:wp="http://schemas.openxmlformats.org/drawingml/2006/wordprocessingDrawing" xmlns:wpg="http://schemas.microsoft.com/office/word/2010/wordprocessingGroup" xmlns:wpi="http://schemas.microsoft.com/office/word/2010/wordprocessingInk" xmlns:wps="http://schemas.microsoft.com/office/word/2010/wordprocessingShape" xmlns:o="urn:schemas-microsoft-com:office:office" xmlns:v="urn:schemas-microsoft-com:vml" xmlns:w10="urn:schemas-microsoft-com:office:word" xmlns:w="http://schemas.openxmlformats.org/wordprocessingml/2006/main" xmlns:w14="http://schemas.microsoft.com/office/word/2010/wordml" xmlns:w15="http://schemas.microsoft.com/office/word/2012/wordml" xmlns:w16cex="http://schemas.microsoft.com/office/word/2018/wordml/cex" xmlns:w16cid="http://schemas.microsoft.com/office/word/2016/wordml/cid" xmlns:w16="http://schemas.microsoft.com/office/word/2018/wordml" xmlns:w16sdtdh="http://schemas.microsoft.com/office/word/2020/wordml/sdtdatahash" xmlns:w16sdtfl="http://schemas.microsoft.com/office/word/2024/wordml/sdtformatlock" xmlns:w16se="http://schemas.microsoft.com/office/word/2015/wordml/symex" xmlns:w16du="http://schemas.microsoft.com/office/word/2023/wordml/word16du" xmlns:wne="http://schemas.microsoft.com/office/word/2006/wordml" mc:Ignorable="w14 w15 w16se w16cid w16 w16cex w16sdtdh w16sdtfl w16du wp14">
+<w:hdr xmlns:wpc="http://schemas.microsoft.com/office/word/2010/wordprocessingCanvas" xmlns:cx="http://schemas.microsoft.com/office/drawing/2014/chartex" xmlns:cx1="http://schemas.microsoft.com/office/drawing/2015/9/8/chartex" xmlns:cx2="http://schemas.microsoft.com/office/drawing/2015/10/21/chartex" xmlns:cx3="http://schemas.microsoft.com/office/drawing/2016/5/9/chartex" xmlns:cx4="http://schemas.microsoft.com/office/drawing/2016/5/10/chartex" xmlns:cx5="http://schemas.microsoft.com/office/drawing/2016/5/11/chartex" xmlns:cx6="http://schemas.microsoft.com/office/drawing/2016/5/12/chartex" xmlns:cx7="http://schemas.microsoft.com/office/drawing/2016/5/13/chartex" xmlns:cx8="http://schemas.microsoft.com/office/drawing/2016/5/14/chartex" xmlns:mc="http://schemas.openxmlformats.org/markup-compatibility/2006" xmlns:aink="http://schemas.microsoft.com/office/drawing/2016/ink" xmlns:am3d="http://schemas.microsoft.com/office/drawing/2017/model3d" xmlns:o="urn:schemas-microsoft-com:office:office" xmlns:oel="http://schemas.microsoft.com/office/2019/extlst" xmlns:r="http://schemas.openxmlformats.org/officeDocument/2006/relationships" xmlns:m="http://schemas.openxmlformats.org/officeDocument/2006/math" xmlns:v="urn:schemas-microsoft-com:vml" xmlns:wp14="http://schemas.microsoft.com/office/word/2010/wordprocessingDrawing" xmlns:wp="http://schemas.openxmlformats.org/drawingml/2006/wordprocessingDrawing" xmlns:w10="urn:schemas-microsoft-com:office:word" xmlns:w="http://schemas.openxmlformats.org/wordprocessingml/2006/main" xmlns:w14="http://schemas.microsoft.com/office/word/2010/wordml" xmlns:w15="http://schemas.microsoft.com/office/word/2012/wordml" xmlns:w16cex="http://schemas.microsoft.com/office/word/2018/wordml/cex" xmlns:w16cid="http://schemas.microsoft.com/office/word/2016/wordml/cid" xmlns:w16="http://schemas.microsoft.com/office/word/2018/wordml" xmlns:w16du="http://schemas.microsoft.com/office/word/2023/wordml/word16du" xmlns:w16sdtdh="http://schemas.microsoft.com/office/word/2020/wordml/sdtdatahash" xmlns:w16sdtfl="http://schemas.microsoft.com/office/word/2024/wordml/sdtformatlock" xmlns:w16se="http://schemas.microsoft.com/office/word/2015/wordml/symex" xmlns:wpg="http://schemas.microsoft.com/office/word/2010/wordprocessingGroup" xmlns:wpi="http://schemas.microsoft.com/office/word/2010/wordprocessingInk" xmlns:wne="http://schemas.microsoft.com/office/word/2006/wordml" xmlns:wps="http://schemas.microsoft.com/office/word/2010/wordprocessingShape" mc:Ignorable="w14 w15 w16se w16cid w16 w16cex w16sdtdh w16sdtfl w16du wp14">
   <w:p>
     <w:pPr>
       <w:pStyle w:val="Header"/>
@@ -3114,7 +3525,7 @@
 </file>
 
 <file path=word/numbering.xml><?xml version="1.0" encoding="utf-8"?>
-<w:numbering xmlns:wpc="http://schemas.microsoft.com/office/word/2010/wordprocessingCanvas" xmlns:cx="http://schemas.microsoft.com/office/drawing/2014/chartex" xmlns:cx1="http://schemas.microsoft.com/office/drawing/2015/9/8/chartex" xmlns:cx2="http://schemas.microsoft.com/office/drawing/2015/10/21/chartex" xmlns:cx3="http://schemas.microsoft.com/office/drawing/2016/5/9/chartex" xmlns:cx4="http://schemas.microsoft.com/office/drawing/2016/5/10/chartex" xmlns:cx5="http://schemas.microsoft.com/office/drawing/2016/5/11/chartex" xmlns:cx6="http://schemas.microsoft.com/office/drawing/2016/5/12/chartex" xmlns:cx7="http://schemas.microsoft.com/office/drawing/2016/5/13/chartex" xmlns:cx8="http://schemas.microsoft.com/office/drawing/2016/5/14/chartex" xmlns:mc="http://schemas.openxmlformats.org/markup-compatibility/2006" xmlns:m="http://schemas.openxmlformats.org/officeDocument/2006/math" xmlns:aink="http://schemas.microsoft.com/office/drawing/2016/ink" xmlns:am3d="http://schemas.microsoft.com/office/drawing/2017/model3d" xmlns:oel="http://schemas.microsoft.com/office/2019/extlst" xmlns:r="http://schemas.openxmlformats.org/officeDocument/2006/relationships" xmlns:wp14="http://schemas.microsoft.com/office/word/2010/wordprocessingDrawing" xmlns:wp="http://schemas.openxmlformats.org/drawingml/2006/wordprocessingDrawing" xmlns:wpg="http://schemas.microsoft.com/office/word/2010/wordprocessingGroup" xmlns:wpi="http://schemas.microsoft.com/office/word/2010/wordprocessingInk" xmlns:wps="http://schemas.microsoft.com/office/word/2010/wordprocessingShape" xmlns:o="urn:schemas-microsoft-com:office:office" xmlns:v="urn:schemas-microsoft-com:vml" xmlns:w10="urn:schemas-microsoft-com:office:word" xmlns:w="http://schemas.openxmlformats.org/wordprocessingml/2006/main" xmlns:w14="http://schemas.microsoft.com/office/word/2010/wordml" xmlns:w15="http://schemas.microsoft.com/office/word/2012/wordml" xmlns:w16cex="http://schemas.microsoft.com/office/word/2018/wordml/cex" xmlns:w16cid="http://schemas.microsoft.com/office/word/2016/wordml/cid" xmlns:w16="http://schemas.microsoft.com/office/word/2018/wordml" xmlns:w16sdtdh="http://schemas.microsoft.com/office/word/2020/wordml/sdtdatahash" xmlns:w16sdtfl="http://schemas.microsoft.com/office/word/2024/wordml/sdtformatlock" xmlns:w16se="http://schemas.microsoft.com/office/word/2015/wordml/symex" xmlns:w16du="http://schemas.microsoft.com/office/word/2023/wordml/word16du" xmlns:wne="http://schemas.microsoft.com/office/word/2006/wordml" mc:Ignorable="w14 w15 w16se w16cid w16 w16cex w16sdtdh w16sdtfl w16du wp14">
+<w:numbering xmlns:wpc="http://schemas.microsoft.com/office/word/2010/wordprocessingCanvas" xmlns:cx="http://schemas.microsoft.com/office/drawing/2014/chartex" xmlns:cx1="http://schemas.microsoft.com/office/drawing/2015/9/8/chartex" xmlns:cx2="http://schemas.microsoft.com/office/drawing/2015/10/21/chartex" xmlns:cx3="http://schemas.microsoft.com/office/drawing/2016/5/9/chartex" xmlns:cx4="http://schemas.microsoft.com/office/drawing/2016/5/10/chartex" xmlns:cx5="http://schemas.microsoft.com/office/drawing/2016/5/11/chartex" xmlns:cx6="http://schemas.microsoft.com/office/drawing/2016/5/12/chartex" xmlns:cx7="http://schemas.microsoft.com/office/drawing/2016/5/13/chartex" xmlns:cx8="http://schemas.microsoft.com/office/drawing/2016/5/14/chartex" xmlns:mc="http://schemas.openxmlformats.org/markup-compatibility/2006" xmlns:aink="http://schemas.microsoft.com/office/drawing/2016/ink" xmlns:am3d="http://schemas.microsoft.com/office/drawing/2017/model3d" xmlns:o="urn:schemas-microsoft-com:office:office" xmlns:oel="http://schemas.microsoft.com/office/2019/extlst" xmlns:r="http://schemas.openxmlformats.org/officeDocument/2006/relationships" xmlns:m="http://schemas.openxmlformats.org/officeDocument/2006/math" xmlns:v="urn:schemas-microsoft-com:vml" xmlns:wp14="http://schemas.microsoft.com/office/word/2010/wordprocessingDrawing" xmlns:wp="http://schemas.openxmlformats.org/drawingml/2006/wordprocessingDrawing" xmlns:w10="urn:schemas-microsoft-com:office:word" xmlns:w="http://schemas.openxmlformats.org/wordprocessingml/2006/main" xmlns:w14="http://schemas.microsoft.com/office/word/2010/wordml" xmlns:w15="http://schemas.microsoft.com/office/word/2012/wordml" xmlns:w16cex="http://schemas.microsoft.com/office/word/2018/wordml/cex" xmlns:w16cid="http://schemas.microsoft.com/office/word/2016/wordml/cid" xmlns:w16="http://schemas.microsoft.com/office/word/2018/wordml" xmlns:w16du="http://schemas.microsoft.com/office/word/2023/wordml/word16du" xmlns:w16sdtdh="http://schemas.microsoft.com/office/word/2020/wordml/sdtdatahash" xmlns:w16sdtfl="http://schemas.microsoft.com/office/word/2024/wordml/sdtformatlock" xmlns:w16se="http://schemas.microsoft.com/office/word/2015/wordml/symex" xmlns:wpg="http://schemas.microsoft.com/office/word/2010/wordprocessingGroup" xmlns:wpi="http://schemas.microsoft.com/office/word/2010/wordprocessingInk" xmlns:wne="http://schemas.microsoft.com/office/word/2006/wordml" xmlns:wps="http://schemas.microsoft.com/office/word/2010/wordprocessingShape" mc:Ignorable="w14 w15 w16se w16cid w16 w16cex w16sdtdh w16sdtfl w16du wp14">
   <w:abstractNum w:abstractNumId="0" w15:restartNumberingAfterBreak="0">
     <w:nsid w:val="05DB53E0"/>
     <w:multiLevelType w:val="hybridMultilevel"/>
@@ -3443,7 +3854,7 @@
 </file>
 
 <file path=word/styles.xml><?xml version="1.0" encoding="utf-8"?>
-<w:styles xmlns:mc="http://schemas.openxmlformats.org/markup-compatibility/2006" xmlns:r="http://schemas.openxmlformats.org/officeDocument/2006/relationships" xmlns:w="http://schemas.openxmlformats.org/wordprocessingml/2006/main" xmlns:w14="http://schemas.microsoft.com/office/word/2010/wordml" xmlns:w15="http://schemas.microsoft.com/office/word/2012/wordml" xmlns:w16cex="http://schemas.microsoft.com/office/word/2018/wordml/cex" xmlns:w16cid="http://schemas.microsoft.com/office/word/2016/wordml/cid" xmlns:w16="http://schemas.microsoft.com/office/word/2018/wordml" xmlns:w16sdtdh="http://schemas.microsoft.com/office/word/2020/wordml/sdtdatahash" xmlns:w16sdtfl="http://schemas.microsoft.com/office/word/2024/wordml/sdtformatlock" xmlns:w16se="http://schemas.microsoft.com/office/word/2015/wordml/symex" xmlns:w16du="http://schemas.microsoft.com/office/word/2023/wordml/word16du" mc:Ignorable="w14 w15 w16se w16cid w16 w16cex w16sdtdh w16sdtfl w16du">
+<w:styles xmlns:mc="http://schemas.openxmlformats.org/markup-compatibility/2006" xmlns:r="http://schemas.openxmlformats.org/officeDocument/2006/relationships" xmlns:w="http://schemas.openxmlformats.org/wordprocessingml/2006/main" xmlns:w14="http://schemas.microsoft.com/office/word/2010/wordml" xmlns:w15="http://schemas.microsoft.com/office/word/2012/wordml" xmlns:w16cex="http://schemas.microsoft.com/office/word/2018/wordml/cex" xmlns:w16cid="http://schemas.microsoft.com/office/word/2016/wordml/cid" xmlns:w16="http://schemas.microsoft.com/office/word/2018/wordml" xmlns:w16du="http://schemas.microsoft.com/office/word/2023/wordml/word16du" xmlns:w16sdtdh="http://schemas.microsoft.com/office/word/2020/wordml/sdtdatahash" xmlns:w16sdtfl="http://schemas.microsoft.com/office/word/2024/wordml/sdtformatlock" xmlns:w16se="http://schemas.microsoft.com/office/word/2015/wordml/symex" mc:Ignorable="w14 w15 w16se w16cid w16 w16cex w16sdtdh w16sdtfl w16du">
   <w:docDefaults>
     <w:rPrDefault>
       <w:rPr>

</xml_diff>